<commit_message>
Add User Music Creation: 8086 RAM Composer (composer.asm) & 16-Step Studio Sequencer
</commit_message>
<xml_diff>
--- a/Assets/Documentation/CrimsonOrbit_Presentation_Script.docx
+++ b/Assets/Documentation/CrimsonOrbit_Presentation_Script.docx
@@ -388,7 +388,7 @@
           <w:color w:val="E65100"/>
           <w:sz w:val="19"/>
         </w:rPr>
-        <w:t>ASSIGNED ROLE: JUKEBOX PLAYER &amp; VISUALIZER (EMU8086 &amp; HTML5 SPECTRUM EQUALIZER)</w:t>
+        <w:t>ASSIGNED ROLE: JUKEBOX PLAYER, VISUALIZER &amp; CUSTOM MUSIC COMPOSER (EMU8086 &amp; WEB)</w:t>
       </w:r>
     </w:p>
     <w:p>
@@ -408,13 +408,18 @@
           <w:rFonts w:ascii="Arial" w:hAnsi="Arial"/>
           <w:sz w:val="19"/>
         </w:rPr>
-        <w:t>Thank you, Hari. Building on Hari's song notes, I created the Jukebox Song Player and Moving Visualizers in both emu8086 and HTML/CSS/JavaScript.</w:t>
+        <w:t>Thank you, Hari. Building on Hari's song notes, I created the Jukebox Song Player, Moving Visualizers, and the Custom Music Composer in both emu8086 and HTML/CSS/JavaScript.</w:t>
         <w:br/>
         <w:br/>
-        <w:t>In emu8086 assembly (songs.asm), I wrote the automatic player that reads through the song notes, sends sound to the PC speaker, and animates 8 colorful equalizer bars bouncing up and down on screen. I also made sure that pressing the [ESC] key stops the song immediately and returns cleanly to the main menu without freezing the emulator.</w:t>
+        <w:t>In emu8086 assembly (demo.asm), I wrote the automatic player that reads through the song notes, sends sound to the PC speaker, and animates 8 colorful equalizer bars bouncing up and down on screen. I also made sure that pressing the [ESC] key stops the song immediately and returns cleanly to the main menu without freezing the emulator.</w:t>
         <w:br/>
         <w:br/>
-        <w:t>In our HTML and JavaScript studio, I upgraded this into a Real-Time 60 FPS Moving Spectrum Equalizer. As songs play, colorful visualizer bars jump up and down to the music and display live frequency numbers. Users can also click buttons to hear any song played on Real Grand Piano, Real Acoustic Guitar, or a Rock Drum Beat.</w:t>
+        <w:t>User Music Creation (Professor's Request):</w:t>
+        <w:br/>
+        <w:t>Per our faculty guide's suggestion, we added a feature where users can create their own music just like the pre-installed songs! I developed the Custom Music Composer module (composer.asm) in emu8086. Users can play keys A through K, and the notes are recorded directly into 8086 RAM memory as frequency and duration pairs. You can change note lengths, undo notes, and play your custom created song immediately! Your custom song also appears as Option 7 in the Jukebox Repertoire, so you can play your own song in Grand Piano, Lead Guitar, or Drum style with dancing equalizer bars!</w:t>
+        <w:br/>
+        <w:br/>
+        <w:t>In our HTML and JavaScript studio, I upgraded this into a 16-Step Multi-Track Sequencer and 60 FPS Spectrum Equalizer. Users can click grid squares across 8 instrument tracks to compose custom looping beats and melodies with real studio sounds.</w:t>
         <w:br/>
         <w:br/>
         <w:t>I will now pass back to Akash to present our system assembling and live demonstration.</w:t>
@@ -438,9 +443,9 @@
           <w:i/>
           <w:sz w:val="18"/>
         </w:rPr>
-        <w:t>Teacher: "Ghansham, what did you build for the song player?"</w:t>
+        <w:t>Teacher: "Ghansham, how can users create their own music in your project?"</w:t>
         <w:br/>
-        <w:t>Your Answer: "Sir/Ma'am, in emu8086 assembly, I built the automatic jukebox player that plays through songs, animated 8 text visualizer bars on screen, and added [ESC] key support to stop playback anytime. In HTML and JavaScript, I built the colorful moving spectrum equalizer that dances in real time to the music."</w:t>
+        <w:t>Your Answer: "Sir/Ma'am, in emu8086 assembly, I developed composer.asm where notes played on the keyboard are stored into a RAM buffer as frequency and duration pairs. Users can edit note lengths and play their custom song in Piano, Guitar, or Drum style with the visualizer! In the Web Studio, I built a 16-step sequencer matrix across 8 instrument tracks that loops your custom song with real acoustic samples."</w:t>
       </w:r>
     </w:p>
     <w:p>

</xml_diff>